<commit_message>
﻿chore(interaprendizaje): regenerar artefactos del extractor aulatex
- Actualiza conceptos, fichas y trazabilidad tras nueva depuración
- Sustituye "Derechos lingüísticos" por conceptos interculturales
- Reordena rondas de refinamiento y consultas asociadas
- Regenera resúmenes de planeación (base, anthropic y local)
- Ajusta evidencia por página y advertencias del análisis
</commit_message>
<xml_diff>
--- a/UnADM/licenciatura-en-derecho-unadm/interaprendizaje-en-ambientes-virtuales-lde/extractor-aulatex/fichas_conceptos.docx
+++ b/UnADM/licenciatura-en-derecho-unadm/interaprendizaje-en-ambientes-virtuales-lde/extractor-aulatex/fichas_conceptos.docx
@@ -112,7 +112,7 @@
         <w:pStyle w:val="Heading2"/>
       </w:pPr>
       <w:r>
-        <w:t>Ficha 03. Perspectiva intercultural</w:t>
+        <w:t>Ficha 03. Diversidad lingüística</w:t>
       </w:r>
     </w:p>
     <w:p>
@@ -123,7 +123,7 @@
         <w:t xml:space="preserve">Fuentes: </w:t>
       </w:r>
       <w:r>
-        <w:t>README.md</w:t>
+        <w:t>Sin fuentes detectadas</w:t>
       </w:r>
     </w:p>
     <w:p>
@@ -134,23 +134,12 @@
         <w:t xml:space="preserve">Ubicaciones: </w:t>
       </w:r>
       <w:r>
-        <w:t>README.md, bloque 1</w:t>
+        <w:t>Sin ubicaciones detectadas</w:t>
       </w:r>
     </w:p>
     <w:p>
-      <w:pPr>
-        <w:pStyle w:val="Heading3"/>
-      </w:pPr>
       <w:r>
-        <w:t>README.md — bloque 1 — similitud 0.0977</w:t>
-      </w:r>
-    </w:p>
-    <w:p>
-      <w:pPr>
-        <w:ind w:left="360"/>
-      </w:pPr>
-      <w:r>
-        <w:t>“Referencias - Interaprendizaje en ambientes virtuales Carpeta para planeaciones, lecturas, notas, jurisprudencia, normas, casos, datos y evidencia auxiliar de la asignatura. Convenciones Registrar toda fuente final en ../interaprendizaje-en-ambientes-virtuales.bib.”</w:t>
+        <w:t>No se localizaron citas textuales por encima del umbral configurado.</w:t>
       </w:r>
     </w:p>
     <w:p>
@@ -161,7 +150,7 @@
         <w:t xml:space="preserve">Observación automática: </w:t>
       </w:r>
       <w:r>
-        <w:t>La ficha presenta coincidencias débiles; se recomienda validar manualmente las citas.</w:t>
+        <w:t>No se localizaron fragmentos por encima del umbral configurado. Conviene revisar el concepto o ampliar el corpus.</w:t>
       </w:r>
     </w:p>
     <w:p>
@@ -215,64 +204,7 @@
         <w:pStyle w:val="Heading2"/>
       </w:pPr>
       <w:r>
-        <w:t>Ficha 05. Diversidad lingüística</w:t>
-      </w:r>
-    </w:p>
-    <w:p>
-      <w:r>
-        <w:rPr>
-          <w:b/>
-        </w:rPr>
-        <w:t xml:space="preserve">Fuentes: </w:t>
-      </w:r>
-      <w:r>
-        <w:t>README.md</w:t>
-      </w:r>
-    </w:p>
-    <w:p>
-      <w:r>
-        <w:rPr>
-          <w:b/>
-        </w:rPr>
-        <w:t xml:space="preserve">Ubicaciones: </w:t>
-      </w:r>
-      <w:r>
-        <w:t>README.md, bloque 1</w:t>
-      </w:r>
-    </w:p>
-    <w:p>
-      <w:pPr>
-        <w:pStyle w:val="Heading3"/>
-      </w:pPr>
-      <w:r>
-        <w:t>README.md — bloque 1 — similitud 0.0977</w:t>
-      </w:r>
-    </w:p>
-    <w:p>
-      <w:pPr>
-        <w:ind w:left="360"/>
-      </w:pPr>
-      <w:r>
-        <w:t>“Referencias - Interaprendizaje en ambientes virtuales Carpeta para planeaciones, lecturas, notas, jurisprudencia, normas, casos, datos y evidencia auxiliar de la asignatura. Convenciones Registrar toda fuente final en ../interaprendizaje-en-ambientes-virtuales.bib.”</w:t>
-      </w:r>
-    </w:p>
-    <w:p>
-      <w:r>
-        <w:rPr>
-          <w:b/>
-        </w:rPr>
-        <w:t xml:space="preserve">Observación automática: </w:t>
-      </w:r>
-      <w:r>
-        <w:t>La ficha presenta coincidencias débiles; se recomienda validar manualmente las citas.</w:t>
-      </w:r>
-    </w:p>
-    <w:p>
-      <w:pPr>
-        <w:pStyle w:val="Heading2"/>
-      </w:pPr>
-      <w:r>
-        <w:t>Ficha 06. Derechos lingüísticos</w:t>
+        <w:t>Ficha 05. Perspectiva intercultural</w:t>
       </w:r>
     </w:p>
     <w:p>

</xml_diff>

<commit_message>
﻿chore(interaprendizaje): actualizar artefactos del extractor
- Reajusta conceptos detectados y depurados hacia el enfoque intercultural
- Regenera fichas, resúmenes y trazabilidad con el nuevo tema jurídico
- Actualiza refinamiento de fichas y evidencia por página
</commit_message>
<xml_diff>
--- a/UnADM/licenciatura-en-derecho-unadm/interaprendizaje-en-ambientes-virtuales-lde/extractor-aulatex/fichas_conceptos.docx
+++ b/UnADM/licenciatura-en-derecho-unadm/interaprendizaje-en-ambientes-virtuales-lde/extractor-aulatex/fichas_conceptos.docx
@@ -66,7 +66,7 @@
         <w:pStyle w:val="Heading2"/>
       </w:pPr>
       <w:r>
-        <w:t>Ficha 02. Diversidad cultural</w:t>
+        <w:t>Ficha 02. Diversidad cultural y lingüística</w:t>
       </w:r>
     </w:p>
     <w:p>
@@ -112,7 +112,7 @@
         <w:pStyle w:val="Heading2"/>
       </w:pPr>
       <w:r>
-        <w:t>Ficha 03. Diversidad lingüística</w:t>
+        <w:t>Ficha 03. Perspectiva intercultural</w:t>
       </w:r>
     </w:p>
     <w:p>
@@ -158,7 +158,7 @@
         <w:pStyle w:val="Heading2"/>
       </w:pPr>
       <w:r>
-        <w:t>Ficha 04. Narración situada / comunitaria</w:t>
+        <w:t>Ficha 04. Composición pluricultural de la nación</w:t>
       </w:r>
     </w:p>
     <w:p>
@@ -169,7 +169,7 @@
         <w:t xml:space="preserve">Fuentes: </w:t>
       </w:r>
       <w:r>
-        <w:t>Sin fuentes detectadas</w:t>
+        <w:t>README.md</w:t>
       </w:r>
     </w:p>
     <w:p>
@@ -180,12 +180,23 @@
         <w:t xml:space="preserve">Ubicaciones: </w:t>
       </w:r>
       <w:r>
-        <w:t>Sin ubicaciones detectadas</w:t>
+        <w:t>README.md, bloque 1</w:t>
       </w:r>
     </w:p>
     <w:p>
+      <w:pPr>
+        <w:pStyle w:val="Heading3"/>
+      </w:pPr>
       <w:r>
-        <w:t>No se localizaron citas textuales por encima del umbral configurado.</w:t>
+        <w:t>README.md — bloque 1 — similitud 0.0977</w:t>
+      </w:r>
+    </w:p>
+    <w:p>
+      <w:pPr>
+        <w:ind w:left="360"/>
+      </w:pPr>
+      <w:r>
+        <w:t>“Referencias - Interaprendizaje en ambientes virtuales Carpeta para planeaciones, lecturas, notas, jurisprudencia, normas, casos, datos y evidencia auxiliar de la asignatura. Convenciones Registrar toda fuente final en ../interaprendizaje-en-ambientes-virtuales.bib.”</w:t>
       </w:r>
     </w:p>
     <w:p>
@@ -196,7 +207,7 @@
         <w:t xml:space="preserve">Observación automática: </w:t>
       </w:r>
       <w:r>
-        <w:t>No se localizaron fragmentos por encima del umbral configurado. Conviene revisar el concepto o ampliar el corpus.</w:t>
+        <w:t>La ficha presenta coincidencias débiles; se recomienda validar manualmente las citas.</w:t>
       </w:r>
     </w:p>
     <w:p>
@@ -204,7 +215,7 @@
         <w:pStyle w:val="Heading2"/>
       </w:pPr>
       <w:r>
-        <w:t>Ficha 05. Perspectiva intercultural</w:t>
+        <w:t>Ficha 05. Derechos lingüísticos</w:t>
       </w:r>
     </w:p>
     <w:p>

</xml_diff>